<commit_message>
Part 4 and 5
</commit_message>
<xml_diff>
--- a/lab_3/questions_lab3_32a_comm_num.docx
+++ b/lab_3/questions_lab3_32a_comm_num.docx
@@ -366,258 +366,10 @@
     <w:p>
       <w:pPr>
         <w:rPr>
-          <w:lang w:val="fr-CA"/>
-        </w:rPr>
-      </w:pPr>
-      <w:r>
-        <w:rPr>
-          <w:lang w:val="fr-CA"/>
-        </w:rPr>
-        <w:t>.</w:t>
-      </w:r>
-    </w:p>
-    <w:p>
-      <w:pPr>
-        <w:pStyle w:val="Subtitle"/>
-        <w:rPr>
-          <w:lang w:val="fr-CA"/>
-        </w:rPr>
-      </w:pPr>
-      <w:r>
-        <w:rPr>
-          <w:lang w:val="fr-CA"/>
-        </w:rPr>
-        <w:lastRenderedPageBreak/>
-        <w:t xml:space="preserve">Partie </w:t>
-      </w:r>
-      <w:r>
-        <w:rPr>
-          <w:lang w:val="fr-CA"/>
-        </w:rPr>
-        <w:t>4</w:t>
-      </w:r>
-    </w:p>
-    <w:p>
-      <w:pPr>
-        <w:rPr>
-          <w:lang w:val="fr-CA"/>
-        </w:rPr>
-      </w:pPr>
-      <w:r>
-        <w:rPr>
-          <w:lang w:val="fr-CA"/>
-        </w:rPr>
-        <w:t xml:space="preserve">Avec une capture d’image dans l’oscilloscope, capture la ligne </w:t>
-      </w:r>
-      <w:proofErr w:type="spellStart"/>
-      <w:r>
-        <w:rPr>
-          <w:lang w:val="fr-CA"/>
-        </w:rPr>
-        <w:t>RxD</w:t>
-      </w:r>
-      <w:proofErr w:type="spellEnd"/>
-      <w:r>
-        <w:rPr>
-          <w:lang w:val="fr-CA"/>
-        </w:rPr>
-        <w:t xml:space="preserve"> et </w:t>
-      </w:r>
-      <w:proofErr w:type="spellStart"/>
-      <w:r>
-        <w:rPr>
-          <w:lang w:val="fr-CA"/>
-        </w:rPr>
-        <w:t>TxD</w:t>
-      </w:r>
-      <w:proofErr w:type="spellEnd"/>
-      <w:r>
-        <w:rPr>
-          <w:lang w:val="fr-CA"/>
-        </w:rPr>
-        <w:t xml:space="preserve"> de la ligne RS232 qui envoie les caractères ‘</w:t>
-      </w:r>
-      <w:r>
-        <w:rPr>
-          <w:lang w:val="fr-CA"/>
-        </w:rPr>
-        <w:t>port’</w:t>
-      </w:r>
-      <w:r>
-        <w:rPr>
-          <w:lang w:val="fr-CA"/>
-        </w:rPr>
-        <w:t>. Avec les curseurs, afficher la tension de l’envoi du data.</w:t>
-      </w:r>
-    </w:p>
-    <w:p>
-      <w:pPr>
-        <w:rPr>
-          <w:lang w:val="fr-CA"/>
-        </w:rPr>
-      </w:pPr>
-      <w:r>
-        <w:rPr>
-          <w:lang w:val="fr-CA"/>
-        </w:rPr>
-        <w:t>.</w:t>
-      </w:r>
-    </w:p>
-    <w:p>
-      <w:pPr>
-        <w:rPr>
-          <w:lang w:val="fr-CA"/>
-        </w:rPr>
-      </w:pPr>
-      <w:r>
-        <w:rPr>
-          <w:lang w:val="fr-CA"/>
-        </w:rPr>
-        <w:t>.</w:t>
-      </w:r>
-    </w:p>
-    <w:p>
-      <w:pPr>
-        <w:rPr>
-          <w:lang w:val="fr-CA"/>
-        </w:rPr>
-      </w:pPr>
-      <w:r>
-        <w:rPr>
-          <w:lang w:val="fr-CA"/>
-        </w:rPr>
-        <w:t>.</w:t>
-      </w:r>
-    </w:p>
-    <w:p>
-      <w:pPr>
-        <w:rPr>
-          <w:lang w:val="fr-CA"/>
-        </w:rPr>
-      </w:pPr>
-      <w:r>
-        <w:rPr>
-          <w:lang w:val="fr-CA"/>
-        </w:rPr>
-        <w:t>.</w:t>
-      </w:r>
-    </w:p>
-    <w:p>
-      <w:pPr>
-        <w:rPr>
-          <w:lang w:val="fr-CA"/>
-        </w:rPr>
-      </w:pPr>
-    </w:p>
-    <w:p>
-      <w:pPr>
-        <w:rPr>
-          <w:lang w:val="fr-CA"/>
-        </w:rPr>
-      </w:pPr>
-    </w:p>
-    <w:p>
-      <w:pPr>
-        <w:pStyle w:val="Subtitle"/>
-        <w:rPr>
-          <w:lang w:val="fr-CA"/>
-        </w:rPr>
-      </w:pPr>
-      <w:r>
-        <w:rPr>
-          <w:lang w:val="fr-CA"/>
-        </w:rPr>
-        <w:t xml:space="preserve">Partie </w:t>
-      </w:r>
-      <w:r>
-        <w:rPr>
-          <w:lang w:val="fr-CA"/>
-        </w:rPr>
-        <w:t>5</w:t>
-      </w:r>
-    </w:p>
-    <w:p>
-      <w:pPr>
-        <w:rPr>
-          <w:lang w:val="fr-CA"/>
-        </w:rPr>
-      </w:pPr>
-      <w:r>
-        <w:rPr>
-          <w:lang w:val="fr-CA"/>
-        </w:rPr>
-        <w:t>Le signal sérielle 2</w:t>
-      </w:r>
-      <w:r>
-        <w:rPr>
-          <w:lang w:val="fr-CA"/>
-        </w:rPr>
-        <w:t xml:space="preserve"> (Serial2)</w:t>
-      </w:r>
-      <w:r>
-        <w:rPr>
-          <w:lang w:val="fr-CA"/>
-        </w:rPr>
-        <w:t xml:space="preserve"> est envoy</w:t>
-      </w:r>
-      <w:r>
-        <w:rPr>
-          <w:lang w:val="fr-CA"/>
-        </w:rPr>
-        <w:t>é</w:t>
-      </w:r>
-      <w:r>
-        <w:rPr>
-          <w:lang w:val="fr-CA"/>
-        </w:rPr>
-        <w:t xml:space="preserve"> à quelle vitesse?</w:t>
-      </w:r>
-    </w:p>
-    <w:p>
-      <w:pPr>
-        <w:rPr>
-          <w:lang w:val="fr-CA"/>
-        </w:rPr>
-      </w:pPr>
-      <w:r>
-        <w:rPr>
-          <w:lang w:val="fr-CA"/>
-        </w:rPr>
-        <w:t>.</w:t>
-      </w:r>
-    </w:p>
-    <w:p>
-      <w:pPr>
-        <w:rPr>
-          <w:lang w:val="fr-CA"/>
-        </w:rPr>
-      </w:pPr>
-      <w:r>
-        <w:rPr>
-          <w:lang w:val="fr-CA"/>
-        </w:rPr>
-        <w:t>.</w:t>
-      </w:r>
-    </w:p>
-    <w:p>
-      <w:pPr>
-        <w:rPr>
-          <w:lang w:val="fr-CA"/>
-        </w:rPr>
-      </w:pPr>
-      <w:r>
-        <w:rPr>
-          <w:lang w:val="fr-CA"/>
-        </w:rPr>
-        <w:t>.</w:t>
-      </w:r>
-    </w:p>
-    <w:p>
-      <w:pPr>
-        <w:rPr>
           <w:rStyle w:val="SubtleEmphasis"/>
           <w:i w:val="0"/>
           <w:iCs w:val="0"/>
+          <w:color w:val="auto"/>
           <w:lang w:val="fr-CA"/>
         </w:rPr>
       </w:pPr>
@@ -627,16 +379,6 @@
         </w:rPr>
         <w:t>.</w:t>
       </w:r>
-    </w:p>
-    <w:p>
-      <w:pPr>
-        <w:rPr>
-          <w:rStyle w:val="SubtleEmphasis"/>
-          <w:i w:val="0"/>
-          <w:iCs w:val="0"/>
-          <w:lang w:val="fr-CA"/>
-        </w:rPr>
-      </w:pPr>
     </w:p>
     <w:sectPr>
       <w:pgSz w:w="12240" w:h="15840"/>

</xml_diff>